<commit_message>
Ajustes: CMD do Dockerfile, autoescape, remove comentarios do docx e campos obrigatorios
</commit_message>
<xml_diff>
--- a/contracts/Prestação de Serviços - Final.docx
+++ b/contracts/Prestação de Serviços - Final.docx
@@ -669,7 +669,7 @@
           <w:szCs w:val="22"/>
           <w:highlight w:val="yellow"/>
         </w:rPr>
-        <w:t xml:space="preserve">, estado de </w:t>
+        <w:t>,</w:t>
       </w:r>
       <w:r>
         <w:rPr>
@@ -677,6 +677,22 @@
           <w:szCs w:val="22"/>
           <w:highlight w:val="yellow"/>
         </w:rPr>
+        <w:t xml:space="preserve"> </w:t>
+      </w:r>
+      <w:r>
+        <w:rPr>
+          <w:rFonts w:ascii="Segoe UI" w:hAnsi="Segoe UI" w:cs="Segoe UI"/>
+          <w:szCs w:val="22"/>
+          <w:highlight w:val="yellow"/>
+        </w:rPr>
+        <w:t xml:space="preserve">estado de </w:t>
+      </w:r>
+      <w:r>
+        <w:rPr>
+          <w:rFonts w:ascii="Segoe UI" w:hAnsi="Segoe UI" w:cs="Segoe UI"/>
+          <w:szCs w:val="22"/>
+          <w:highlight w:val="yellow"/>
+        </w:rPr>
         <w:t>{{CONTRATADA_ESTADO}}</w:t>
       </w:r>
       <w:r>
@@ -709,7 +725,77 @@
           <w:szCs w:val="22"/>
           <w:highlight w:val="yellow"/>
         </w:rPr>
-        <w:t xml:space="preserve">, CEP </w:t>
+        <w:t xml:space="preserve">, </w:t>
+      </w:r>
+      <w:r>
+        <w:rPr>
+          <w:rFonts w:ascii="Segoe UI" w:hAnsi="Segoe UI" w:cs="Segoe UI"/>
+          <w:szCs w:val="22"/>
+          <w:highlight w:val="yellow"/>
+        </w:rPr>
+        <w:t>n°</w:t>
+      </w:r>
+      <w:r>
+        <w:rPr>
+          <w:rFonts w:ascii="Segoe UI" w:hAnsi="Segoe UI" w:cs="Segoe UI"/>
+          <w:szCs w:val="22"/>
+          <w:highlight w:val="yellow"/>
+        </w:rPr>
+        <w:t xml:space="preserve"> {{</w:t>
+      </w:r>
+      <w:r>
+        <w:rPr>
+          <w:rFonts w:ascii="Segoe UI" w:hAnsi="Segoe UI" w:cs="Segoe UI"/>
+          <w:szCs w:val="22"/>
+        </w:rPr>
+        <w:t>CONTRATADA_NUMERO</w:t>
+      </w:r>
+      <w:r>
+        <w:rPr>
+          <w:rFonts w:ascii="Segoe UI" w:hAnsi="Segoe UI" w:cs="Segoe UI"/>
+          <w:szCs w:val="22"/>
+        </w:rPr>
+        <w:t>}}</w:t>
+      </w:r>
+      <w:r>
+        <w:rPr>
+          <w:rFonts w:ascii="Segoe UI" w:hAnsi="Segoe UI" w:cs="Segoe UI"/>
+          <w:szCs w:val="22"/>
+        </w:rPr>
+        <w:t>, bairro {{</w:t>
+      </w:r>
+      <w:r>
+        <w:t xml:space="preserve"> </w:t>
+      </w:r>
+      <w:r>
+        <w:rPr>
+          <w:rFonts w:ascii="Segoe UI" w:hAnsi="Segoe UI" w:cs="Segoe UI"/>
+          <w:szCs w:val="22"/>
+        </w:rPr>
+        <w:t>CONTRATADA_BAIRRO</w:t>
+      </w:r>
+      <w:r>
+        <w:rPr>
+          <w:rFonts w:ascii="Segoe UI" w:hAnsi="Segoe UI" w:cs="Segoe UI"/>
+          <w:szCs w:val="22"/>
+        </w:rPr>
+        <w:t>}},</w:t>
+      </w:r>
+      <w:r>
+        <w:rPr>
+          <w:rFonts w:ascii="Segoe UI" w:hAnsi="Segoe UI" w:cs="Segoe UI"/>
+          <w:szCs w:val="22"/>
+          <w:highlight w:val="yellow"/>
+        </w:rPr>
+        <w:t xml:space="preserve"> </w:t>
+      </w:r>
+      <w:r>
+        <w:rPr>
+          <w:rFonts w:ascii="Segoe UI" w:hAnsi="Segoe UI" w:cs="Segoe UI"/>
+          <w:szCs w:val="22"/>
+          <w:highlight w:val="yellow"/>
+        </w:rPr>
+        <w:t xml:space="preserve">CEP </w:t>
       </w:r>
       <w:r>
         <w:rPr>
@@ -918,7 +1004,6 @@
           <w:rFonts w:ascii="Segoe UI" w:hAnsi="Segoe UI" w:cs="Segoe UI"/>
           <w:szCs w:val="22"/>
         </w:rPr>
-        <w:lastRenderedPageBreak/>
         <w:t xml:space="preserve">A </w:t>
       </w:r>
       <w:r>
@@ -17489,7 +17574,7 @@
               <v:shape id="_x0000_i1025" type="#_x0000_t75" style="width:180pt;height:36pt">
                 <v:imagedata r:id="rId1" o:title=""/>
               </v:shape>
-              <o:OLEObject Type="Embed" ProgID="PBrush" ShapeID="_x0000_i1025" DrawAspect="Content" ObjectID="_1851782480" r:id="rId2"/>
+              <o:OLEObject Type="Embed" ProgID="PBrush" ShapeID="_x0000_i1025" DrawAspect="Content" ObjectID="_1852974377" r:id="rId2"/>
             </w:object>
           </w:r>
         </w:p>
@@ -24555,15 +24640,6 @@
 </file>
 
 <file path=customXml/item1.xml><?xml version="1.0" encoding="utf-8"?>
-<?mso-contentType ?>
-<FormTemplates xmlns="http://schemas.microsoft.com/sharepoint/v3/contenttype/forms">
-  <Display>DocumentLibraryForm</Display>
-  <Edit>DocumentLibraryForm</Edit>
-  <New>DocumentLibraryForm</New>
-</FormTemplates>
-</file>
-
-<file path=customXml/item2.xml><?xml version="1.0" encoding="utf-8"?>
 <p:properties xmlns:p="http://schemas.microsoft.com/office/2006/metadata/properties" xmlns:xsi="http://www.w3.org/2001/XMLSchema-instance" xmlns:pc="http://schemas.microsoft.com/office/infopath/2007/PartnerControls">
   <documentManagement>
     <lcf76f155ced4ddcb4097134ff3c332f xmlns="91123dfd-b738-4954-b4e0-9af3b08c5989">
@@ -24574,7 +24650,20 @@
 </p:properties>
 </file>
 
+<file path=customXml/item2.xml><?xml version="1.0" encoding="utf-8"?>
+<?mso-contentType ?>
+<FormTemplates xmlns="http://schemas.microsoft.com/sharepoint/v3/contenttype/forms">
+  <Display>DocumentLibraryForm</Display>
+  <Edit>DocumentLibraryForm</Edit>
+  <New>DocumentLibraryForm</New>
+</FormTemplates>
+</file>
+
 <file path=customXml/item3.xml><?xml version="1.0" encoding="utf-8"?>
+<b:Sources xmlns:b="http://schemas.openxmlformats.org/officeDocument/2006/bibliography" xmlns="http://schemas.openxmlformats.org/officeDocument/2006/bibliography" SelectedStyle="\APA.XSL" StyleName="APA"/>
+</file>
+
+<file path=customXml/item4.xml><?xml version="1.0" encoding="utf-8"?>
 <ct:contentTypeSchema xmlns:ct="http://schemas.microsoft.com/office/2006/metadata/contentType" xmlns:ma="http://schemas.microsoft.com/office/2006/metadata/properties/metaAttributes" ct:_="" ma:_="" ma:contentTypeName="Document" ma:contentTypeID="0x0101000E29850FEC2F8845A02B62A877A275ED" ma:contentTypeVersion="11" ma:contentTypeDescription="Create a new document." ma:contentTypeScope="" ma:versionID="a8055ee1163fcd93abb085c684707c93">
   <xsd:schema xmlns:xsd="http://www.w3.org/2001/XMLSchema" xmlns:xs="http://www.w3.org/2001/XMLSchema" xmlns:p="http://schemas.microsoft.com/office/2006/metadata/properties" xmlns:ns2="91123dfd-b738-4954-b4e0-9af3b08c5989" xmlns:ns3="8bc97772-9ccb-4f1a-a5b0-2d1d89fedf0c" targetNamespace="http://schemas.microsoft.com/office/2006/metadata/properties" ma:root="true" ma:fieldsID="3a25b0fb66be9818fc215e267163e283" ns2:_="" ns3:_="">
     <xsd:import namespace="91123dfd-b738-4954-b4e0-9af3b08c5989"/>
@@ -24769,19 +24858,7 @@
 </ct:contentTypeSchema>
 </file>
 
-<file path=customXml/item4.xml><?xml version="1.0" encoding="utf-8"?>
-<b:Sources xmlns:b="http://schemas.openxmlformats.org/officeDocument/2006/bibliography" xmlns="http://schemas.openxmlformats.org/officeDocument/2006/bibliography" SelectedStyle="\APA.XSL" StyleName="APA"/>
-</file>
-
 <file path=customXml/itemProps1.xml><?xml version="1.0" encoding="utf-8"?>
-<ds:datastoreItem xmlns:ds="http://schemas.openxmlformats.org/officeDocument/2006/customXml" ds:itemID="{521DC979-E75F-4B9F-84D7-01C7F6D8163D}">
-  <ds:schemaRefs>
-    <ds:schemaRef ds:uri="http://schemas.microsoft.com/sharepoint/v3/contenttype/forms"/>
-  </ds:schemaRefs>
-</ds:datastoreItem>
-</file>
-
-<file path=customXml/itemProps2.xml><?xml version="1.0" encoding="utf-8"?>
 <ds:datastoreItem xmlns:ds="http://schemas.openxmlformats.org/officeDocument/2006/customXml" ds:itemID="{FE5344EB-C00D-425C-BCF7-22C4C8353DA3}">
   <ds:schemaRefs>
     <ds:schemaRef ds:uri="http://schemas.microsoft.com/office/2006/metadata/properties"/>
@@ -24792,7 +24869,23 @@
 </ds:datastoreItem>
 </file>
 
+<file path=customXml/itemProps2.xml><?xml version="1.0" encoding="utf-8"?>
+<ds:datastoreItem xmlns:ds="http://schemas.openxmlformats.org/officeDocument/2006/customXml" ds:itemID="{521DC979-E75F-4B9F-84D7-01C7F6D8163D}">
+  <ds:schemaRefs>
+    <ds:schemaRef ds:uri="http://schemas.microsoft.com/sharepoint/v3/contenttype/forms"/>
+  </ds:schemaRefs>
+</ds:datastoreItem>
+</file>
+
 <file path=customXml/itemProps3.xml><?xml version="1.0" encoding="utf-8"?>
+<ds:datastoreItem xmlns:ds="http://schemas.openxmlformats.org/officeDocument/2006/customXml" ds:itemID="{9F04883C-EAD1-4C12-A979-2E67B37B1892}">
+  <ds:schemaRefs>
+    <ds:schemaRef ds:uri="http://schemas.openxmlformats.org/officeDocument/2006/bibliography"/>
+  </ds:schemaRefs>
+</ds:datastoreItem>
+</file>
+
+<file path=customXml/itemProps4.xml><?xml version="1.0" encoding="utf-8"?>
 <ds:datastoreItem xmlns:ds="http://schemas.openxmlformats.org/officeDocument/2006/customXml" ds:itemID="{88703898-DD57-4E86-A4A3-B6730789109F}">
   <ds:schemaRefs>
     <ds:schemaRef ds:uri="http://schemas.microsoft.com/office/2006/metadata/contentType"/>
@@ -24811,14 +24904,6 @@
 </ds:datastoreItem>
 </file>
 
-<file path=customXml/itemProps4.xml><?xml version="1.0" encoding="utf-8"?>
-<ds:datastoreItem xmlns:ds="http://schemas.openxmlformats.org/officeDocument/2006/customXml" ds:itemID="{9F04883C-EAD1-4C12-A979-2E67B37B1892}">
-  <ds:schemaRefs>
-    <ds:schemaRef ds:uri="http://schemas.openxmlformats.org/officeDocument/2006/bibliography"/>
-  </ds:schemaRefs>
-</ds:datastoreItem>
-</file>
-
 <file path=docMetadata/LabelInfo.xml><?xml version="1.0" encoding="utf-8"?>
 <clbl:labelList xmlns:clbl="http://schemas.microsoft.com/office/2020/mipLabelMetadata">
   <clbl:label id="{6006a9c5-d130-408c-bc8e-3b5ecdb17aa0}" enabled="1" method="Standard" siteId="{8d4b558f-7b2e-40ba-ad1f-e04d79e6265a}" removed="0"/>

</xml_diff>